<commit_message>
Rename author to Nora Noor
</commit_message>
<xml_diff>
--- a/the_woman_who_held_on_to_hope.docx
+++ b/the_woman_who_held_on_to_hope.docx
@@ -102,7 +102,7 @@
           <w:sz w:val="32"/>
           <w:szCs w:val="32"/>
         </w:rPr>
-        <w:t xml:space="preserve">Nazdana Noorzai</w:t>
+        <w:t xml:space="preserve">Nora Noor</w:t>
       </w:r>
     </w:p>
     <w:p>
@@ -37588,7 +37588,7 @@
           <w:sz w:val="25"/>
           <w:szCs w:val="25"/>
         </w:rPr>
-        <w:t xml:space="preserve">Nazdana Noorzai</w:t>
+        <w:t xml:space="preserve">Nora Noor</w:t>
       </w:r>
     </w:p>
     <w:sectPr>

</xml_diff>